<commit_message>
Apply peak-season slotting (Gadeyne, S003): spread fast movers + duplicate extreme SKUs; congestion-first
- analysis/peak_slotting.py: pick-concentration analysis (top 1%=43 SKUs=15% of picks; A-class=60% -> 20%/zone if spread across 3)
- build_report_d2: revise slotting policy; new 3.1 Peak-season slotting (congestion control) + 150/200/250% stress-sim plan
- sources S003 (article); assumption A017; phase2 doc golden-zone -> spread/duplicate

Co-Authored-By: Claude Opus 4.8 <noreply@anthropic.com>
</commit_message>
<xml_diff>
--- a/deliverables/Deliverable_2_Future_State.docx
+++ b/deliverables/Deliverable_2_Future_State.docx
@@ -1083,7 +1083,7 @@
               <w:rPr>
                 <w:sz w:val="19"/>
               </w:rPr>
-              <w:t>Velocity/demand-ABC (hot/med/cold); A in golden zone; heavy low</w:t>
+              <w:t>Velocity/demand-ABC (hot/med/cold); fast movers SPREAD across zones + extreme SKUs duplicated (not clustered); heavy low</w:t>
             </w:r>
           </w:p>
         </w:tc>
@@ -1097,7 +1097,7 @@
               <w:rPr>
                 <w:sz w:val="19"/>
               </w:rPr>
-              <w:t>13% of SKUs = 80% of volume</w:t>
+              <w:t>13% SKUs=80% vol; A=60% of picks (congestion, S003)</w:t>
             </w:r>
           </w:p>
         </w:tc>
@@ -1371,6 +1371,178 @@
       <w:pPr>
         <w:spacing w:after="40"/>
       </w:pPr>
+    </w:p>
+    <w:p>
+      <w:pPr>
+        <w:pStyle w:val="Heading2"/>
+      </w:pPr>
+      <w:r>
+        <w:t>3.1 Peak-season slotting (congestion control)</w:t>
+      </w:r>
+    </w:p>
+    <w:p>
+      <w:pPr>
+        <w:spacing w:after="120"/>
+      </w:pPr>
+      <w:r>
+        <w:rPr>
+          <w:b w:val="0"/>
+          <w:i w:val="0"/>
+          <w:color w:val="222222"/>
+          <w:sz w:val="21"/>
+        </w:rPr>
+        <w:t>At peak, congestion — not walk distance — becomes the dominant cost (Gadeyne, S003). Because our peak is spiky (1.83× lines / 2.85× units) and picks are concentrated, a standard 'cluster the fast movers in one golden zone' slotting would jam a single area. We therefore adopt peak-aware slotting:</w:t>
+      </w:r>
+    </w:p>
+    <w:p>
+      <w:pPr>
+        <w:pStyle w:val="ListBullet"/>
+      </w:pPr>
+      <w:r>
+        <w:rPr>
+          <w:b w:val="0"/>
+          <w:sz w:val="21"/>
+        </w:rPr>
+      </w:r>
+      <w:r>
+        <w:rPr>
+          <w:b/>
+          <w:sz w:val="21"/>
+        </w:rPr>
+        <w:t>Picks are concentrated:</w:t>
+      </w:r>
+      <w:r>
+        <w:rPr>
+          <w:b w:val="0"/>
+          <w:sz w:val="21"/>
+        </w:rPr>
+        <w:t xml:space="preserve"> the top 1% of SKUs (~43) do ~15.0% of all picks, and A-class SKUs ~60.0% of picks.</w:t>
+      </w:r>
+    </w:p>
+    <w:p>
+      <w:pPr>
+        <w:pStyle w:val="ListBullet"/>
+      </w:pPr>
+      <w:r>
+        <w:rPr>
+          <w:b w:val="0"/>
+          <w:sz w:val="21"/>
+        </w:rPr>
+      </w:r>
+      <w:r>
+        <w:rPr>
+          <w:b/>
+          <w:sz w:val="21"/>
+        </w:rPr>
+        <w:t>Spread fast movers across all pick zones</w:t>
+      </w:r>
+      <w:r>
+        <w:rPr>
+          <w:b w:val="0"/>
+          <w:sz w:val="21"/>
+        </w:rPr>
+        <w:t xml:space="preserve"> (balanced on peak-day pick frequency, not annual velocity): clustering A in one zone loads it with ~60.0% of picks; spreading across 3 zones drops it to ~20.0% each — roughly a 3× congestion cut.</w:t>
+      </w:r>
+    </w:p>
+    <w:p>
+      <w:pPr>
+        <w:pStyle w:val="ListBullet"/>
+      </w:pPr>
+      <w:r>
+        <w:rPr>
+          <w:b w:val="0"/>
+          <w:sz w:val="21"/>
+        </w:rPr>
+      </w:r>
+      <w:r>
+        <w:rPr>
+          <w:b/>
+          <w:sz w:val="21"/>
+        </w:rPr>
+        <w:t>Duplicate the extreme SKUs</w:t>
+      </w:r>
+      <w:r>
+        <w:rPr>
+          <w:b w:val="0"/>
+          <w:sz w:val="21"/>
+        </w:rPr>
+        <w:t xml:space="preserve"> (~43 items) with multiple pick faces in different zones to enable parallel picking; insert gaps between hot locations.</w:t>
+      </w:r>
+    </w:p>
+    <w:p>
+      <w:pPr>
+        <w:pStyle w:val="ListBullet"/>
+      </w:pPr>
+      <w:r>
+        <w:rPr>
+          <w:b w:val="0"/>
+          <w:sz w:val="21"/>
+        </w:rPr>
+      </w:r>
+      <w:r>
+        <w:rPr>
+          <w:b/>
+          <w:sz w:val="21"/>
+        </w:rPr>
+        <w:t>Re-check affinity groups</w:t>
+      </w:r>
+      <w:r>
+        <w:rPr>
+          <w:b w:val="0"/>
+          <w:sz w:val="21"/>
+        </w:rPr>
+        <w:t xml:space="preserve"> so commonly co-ordered items don't re-concentrate picks in one aisle.</w:t>
+      </w:r>
+    </w:p>
+    <w:p>
+      <w:pPr>
+        <w:pStyle w:val="ListBullet"/>
+      </w:pPr>
+      <w:r>
+        <w:rPr>
+          <w:b w:val="0"/>
+          <w:sz w:val="21"/>
+        </w:rPr>
+      </w:r>
+      <w:r>
+        <w:rPr>
+          <w:b/>
+          <w:sz w:val="21"/>
+        </w:rPr>
+        <w:t>Levers in priority order</w:t>
+      </w:r>
+      <w:r>
+        <w:rPr>
+          <w:b w:val="0"/>
+          <w:sz w:val="21"/>
+        </w:rPr>
+        <w:t xml:space="preserve"> (S003): slotting (before peak) → order batching/clustering → wave-release timing → pick-path sequencing.</w:t>
+      </w:r>
+    </w:p>
+    <w:p>
+      <w:pPr>
+        <w:pStyle w:val="ListBullet"/>
+      </w:pPr>
+      <w:r>
+        <w:rPr>
+          <w:b w:val="0"/>
+          <w:sz w:val="21"/>
+        </w:rPr>
+      </w:r>
+      <w:r>
+        <w:rPr>
+          <w:b/>
+          <w:sz w:val="21"/>
+        </w:rPr>
+        <w:t>Validate by simulation</w:t>
+      </w:r>
+      <w:r>
+        <w:rPr>
+          <w:b w:val="0"/>
+          <w:sz w:val="21"/>
+        </w:rPr>
+        <w:t xml:space="preserve"> at 150% / 200% / 250% of normal volume (Deliverable 3) to confirm whether congestion or pick density governs staffing at peak.</w:t>
+      </w:r>
     </w:p>
     <w:p>
       <w:pPr>
@@ -3661,6 +3833,53 @@
           </w:p>
         </w:tc>
       </w:tr>
+      <w:tr>
+        <w:tc>
+          <w:tcPr>
+            <w:tcW w:type="dxa" w:w="850"/>
+          </w:tcPr>
+          <w:p>
+            <w:r/>
+            <w:r>
+              <w:rPr>
+                <w:sz w:val="19"/>
+              </w:rPr>
+              <w:t>A017</w:t>
+            </w:r>
+          </w:p>
+        </w:tc>
+        <w:tc>
+          <w:tcPr>
+            <w:tcW w:type="dxa" w:w="6520"/>
+          </w:tcPr>
+          <w:p>
+            <w:r/>
+            <w:r>
+              <w:rPr>
+                <w:sz w:val="19"/>
+              </w:rPr>
+              <w:t>Peak-aware slotting: spread fast movers, duplicate extreme SKUs, balance picks/aisle on peak forecast</w:t>
+            </w:r>
+          </w:p>
+        </w:tc>
+        <w:tc>
+          <w:tcPr>
+            <w:tcW w:type="dxa" w:w="1134"/>
+          </w:tcPr>
+          <w:p>
+            <w:pPr>
+              <w:jc w:val="right"/>
+            </w:pPr>
+            <w:r/>
+            <w:r>
+              <w:rPr>
+                <w:sz w:val="19"/>
+              </w:rPr>
+              <w:t>HIGH</w:t>
+            </w:r>
+          </w:p>
+        </w:tc>
+      </w:tr>
     </w:tbl>
     <w:p>
       <w:pPr>

</xml_diff>

<commit_message>
Premium restyle of mapping graphs: rounded shadowed zones, refined palette, scale bar + north arrow, cleaner titles/labels
- shared zone_box/scale_bar/north_arrow helpers + Segoe UI font
- applied to order-flow plan, worker-movement map and 3D massing (cohesive look)

Co-Authored-By: Claude Opus 4.8 <noreply@anthropic.com>
</commit_message>
<xml_diff>
--- a/deliverables/Deliverable_2_Future_State.docx
+++ b/deliverables/Deliverable_2_Future_State.docx
@@ -2177,7 +2177,7 @@
       <w:r>
         <w:drawing>
           <wp:inline xmlns:a="http://schemas.openxmlformats.org/drawingml/2006/main" xmlns:pic="http://schemas.openxmlformats.org/drawingml/2006/picture">
-            <wp:extent cx="5760000" cy="4518621"/>
+            <wp:extent cx="5760000" cy="5432575"/>
             <wp:docPr id="6" name="Picture 6"/>
             <wp:cNvGraphicFramePr>
               <a:graphicFrameLocks noChangeAspect="1"/>
@@ -2198,7 +2198,7 @@
                   <pic:spPr>
                     <a:xfrm>
                       <a:off x="0" y="0"/>
-                      <a:ext cx="5760000" cy="4518621"/>
+                      <a:ext cx="5760000" cy="5432575"/>
                     </a:xfrm>
                     <a:prstGeom prst="rect"/>
                   </pic:spPr>
@@ -2231,7 +2231,7 @@
       <w:r>
         <w:drawing>
           <wp:inline xmlns:a="http://schemas.openxmlformats.org/drawingml/2006/main" xmlns:pic="http://schemas.openxmlformats.org/drawingml/2006/picture">
-            <wp:extent cx="5040000" cy="4123637"/>
+            <wp:extent cx="5040000" cy="4462758"/>
             <wp:docPr id="7" name="Picture 7"/>
             <wp:cNvGraphicFramePr>
               <a:graphicFrameLocks noChangeAspect="1"/>
@@ -2252,7 +2252,7 @@
                   <pic:spPr>
                     <a:xfrm>
                       <a:off x="0" y="0"/>
-                      <a:ext cx="5040000" cy="4123637"/>
+                      <a:ext cx="5040000" cy="4462758"/>
                     </a:xfrm>
                     <a:prstGeom prst="rect"/>
                   </pic:spPr>
@@ -2285,7 +2285,7 @@
       <w:r>
         <w:drawing>
           <wp:inline xmlns:a="http://schemas.openxmlformats.org/drawingml/2006/main" xmlns:pic="http://schemas.openxmlformats.org/drawingml/2006/picture">
-            <wp:extent cx="5760000" cy="4936332"/>
+            <wp:extent cx="5760000" cy="5439651"/>
             <wp:docPr id="8" name="Picture 8"/>
             <wp:cNvGraphicFramePr>
               <a:graphicFrameLocks noChangeAspect="1"/>
@@ -2306,7 +2306,7 @@
                   <pic:spPr>
                     <a:xfrm>
                       <a:off x="0" y="0"/>
-                      <a:ext cx="5760000" cy="4936332"/>
+                      <a:ext cx="5760000" cy="5439651"/>
                     </a:xfrm>
                     <a:prstGeom prst="rect"/>
                   </pic:spPr>

</xml_diff>

<commit_message>
Add native swimlane process map (rendered here, no external app) + include in Deliverable 2 as Fig 1
- analysis/flow_swimlane.py: matplotlib cross-functional swimlane (7 lanes, 23 steps, incl. returns; clean feedback routing)
- build_report_d2: swimlane as Fig 1 overview; renumber figures 2-10

Co-Authored-By: Claude Opus 4.8 <noreply@anthropic.com>
</commit_message>
<xml_diff>
--- a/deliverables/Deliverable_2_Future_State.docx
+++ b/deliverables/Deliverable_2_Future_State.docx
@@ -359,7 +359,61 @@
           <w:color w:val="222222"/>
           <w:sz w:val="21"/>
         </w:rPr>
-        <w:t>Each in-scope process below states the steps, the system transaction, the physical movement, the equipment, and where the Deliverable-1 design choices are applied. Flowcharts follow.</w:t>
+        <w:t>Each in-scope process below states the steps, the system transaction, the physical movement, the equipment, and where the Deliverable-1 design choices are applied. The swimlane (Fig 1) gives the end-to-end overview; per-process flowcharts follow.</w:t>
+      </w:r>
+    </w:p>
+    <w:p>
+      <w:pPr>
+        <w:jc w:val="center"/>
+      </w:pPr>
+      <w:r>
+        <w:drawing>
+          <wp:inline xmlns:a="http://schemas.openxmlformats.org/drawingml/2006/main" xmlns:pic="http://schemas.openxmlformats.org/drawingml/2006/picture">
+            <wp:extent cx="6120000" cy="3731241"/>
+            <wp:docPr id="1" name="Picture 1"/>
+            <wp:cNvGraphicFramePr>
+              <a:graphicFrameLocks noChangeAspect="1"/>
+            </wp:cNvGraphicFramePr>
+            <a:graphic>
+              <a:graphicData uri="http://schemas.openxmlformats.org/drawingml/2006/picture">
+                <pic:pic>
+                  <pic:nvPicPr>
+                    <pic:cNvPr id="0" name="flow_swimlane.png"/>
+                    <pic:cNvPicPr/>
+                  </pic:nvPicPr>
+                  <pic:blipFill>
+                    <a:blip r:embed="rId9"/>
+                    <a:stretch>
+                      <a:fillRect/>
+                    </a:stretch>
+                  </pic:blipFill>
+                  <pic:spPr>
+                    <a:xfrm>
+                      <a:off x="0" y="0"/>
+                      <a:ext cx="6120000" cy="3731241"/>
+                    </a:xfrm>
+                    <a:prstGeom prst="rect"/>
+                  </pic:spPr>
+                </pic:pic>
+              </a:graphicData>
+            </a:graphic>
+          </wp:inline>
+        </w:drawing>
+      </w:r>
+    </w:p>
+    <w:p>
+      <w:pPr>
+        <w:spacing w:after="200"/>
+        <w:jc w:val="center"/>
+      </w:pPr>
+      <w:r>
+        <w:rPr>
+          <w:b w:val="0"/>
+          <w:i/>
+          <w:color w:val="666666"/>
+          <w:sz w:val="17"/>
+        </w:rPr>
+        <w:t>Fig 1. End-to-end future-state process — cross-functional swimlane (all lanes, incl. returns).</w:t>
       </w:r>
     </w:p>
     <w:p>
@@ -428,7 +482,7 @@
         <w:drawing>
           <wp:inline xmlns:a="http://schemas.openxmlformats.org/drawingml/2006/main" xmlns:pic="http://schemas.openxmlformats.org/drawingml/2006/picture">
             <wp:extent cx="4320000" cy="3444888"/>
-            <wp:docPr id="1" name="Picture 1"/>
+            <wp:docPr id="2" name="Picture 2"/>
             <wp:cNvGraphicFramePr>
               <a:graphicFrameLocks noChangeAspect="1"/>
             </wp:cNvGraphicFramePr>
@@ -440,7 +494,7 @@
                     <pic:cNvPicPr/>
                   </pic:nvPicPr>
                   <pic:blipFill>
-                    <a:blip r:embed="rId9"/>
+                    <a:blip r:embed="rId10"/>
                     <a:stretch>
                       <a:fillRect/>
                     </a:stretch>
@@ -471,7 +525,7 @@
           <w:color w:val="666666"/>
           <w:sz w:val="17"/>
         </w:rPr>
-        <w:t>Fig 1. Receiving &amp; putaway flow.</w:t>
+        <w:t>Fig 2. Receiving &amp; putaway flow.</w:t>
       </w:r>
     </w:p>
     <w:p>
@@ -540,7 +594,7 @@
         <w:drawing>
           <wp:inline xmlns:a="http://schemas.openxmlformats.org/drawingml/2006/main" xmlns:pic="http://schemas.openxmlformats.org/drawingml/2006/picture">
             <wp:extent cx="3960000" cy="3470916"/>
-            <wp:docPr id="2" name="Picture 2"/>
+            <wp:docPr id="3" name="Picture 3"/>
             <wp:cNvGraphicFramePr>
               <a:graphicFrameLocks noChangeAspect="1"/>
             </wp:cNvGraphicFramePr>
@@ -552,7 +606,7 @@
                     <pic:cNvPicPr/>
                   </pic:nvPicPr>
                   <pic:blipFill>
-                    <a:blip r:embed="rId10"/>
+                    <a:blip r:embed="rId11"/>
                     <a:stretch>
                       <a:fillRect/>
                     </a:stretch>
@@ -583,7 +637,7 @@
           <w:color w:val="666666"/>
           <w:sz w:val="17"/>
         </w:rPr>
-        <w:t>Fig 2. Replenishment flow.</w:t>
+        <w:t>Fig 3. Replenishment flow.</w:t>
       </w:r>
     </w:p>
     <w:p>
@@ -652,7 +706,7 @@
         <w:drawing>
           <wp:inline xmlns:a="http://schemas.openxmlformats.org/drawingml/2006/main" xmlns:pic="http://schemas.openxmlformats.org/drawingml/2006/picture">
             <wp:extent cx="4320000" cy="3872386"/>
-            <wp:docPr id="3" name="Picture 3"/>
+            <wp:docPr id="4" name="Picture 4"/>
             <wp:cNvGraphicFramePr>
               <a:graphicFrameLocks noChangeAspect="1"/>
             </wp:cNvGraphicFramePr>
@@ -664,7 +718,7 @@
                     <pic:cNvPicPr/>
                   </pic:nvPicPr>
                   <pic:blipFill>
-                    <a:blip r:embed="rId11"/>
+                    <a:blip r:embed="rId12"/>
                     <a:stretch>
                       <a:fillRect/>
                     </a:stretch>
@@ -695,7 +749,7 @@
           <w:color w:val="666666"/>
           <w:sz w:val="17"/>
         </w:rPr>
-        <w:t>Fig 3. Picking flow (zone + batch/wave).</w:t>
+        <w:t>Fig 4. Picking flow (zone + batch/wave).</w:t>
       </w:r>
     </w:p>
     <w:p>
@@ -764,7 +818,7 @@
         <w:drawing>
           <wp:inline xmlns:a="http://schemas.openxmlformats.org/drawingml/2006/main" xmlns:pic="http://schemas.openxmlformats.org/drawingml/2006/picture">
             <wp:extent cx="4320000" cy="4115339"/>
-            <wp:docPr id="4" name="Picture 4"/>
+            <wp:docPr id="5" name="Picture 5"/>
             <wp:cNvGraphicFramePr>
               <a:graphicFrameLocks noChangeAspect="1"/>
             </wp:cNvGraphicFramePr>
@@ -776,7 +830,7 @@
                     <pic:cNvPicPr/>
                   </pic:nvPicPr>
                   <pic:blipFill>
-                    <a:blip r:embed="rId12"/>
+                    <a:blip r:embed="rId13"/>
                     <a:stretch>
                       <a:fillRect/>
                     </a:stretch>
@@ -807,7 +861,7 @@
           <w:color w:val="666666"/>
           <w:sz w:val="17"/>
         </w:rPr>
-        <w:t>Fig 4. Consolidation, packing &amp; shipping flow.</w:t>
+        <w:t>Fig 5. Consolidation, packing &amp; shipping flow.</w:t>
       </w:r>
     </w:p>
     <w:p>
@@ -890,7 +944,7 @@
           <w:b w:val="0"/>
           <w:sz w:val="21"/>
         </w:rPr>
-        <w:t xml:space="preserve"> steps 7–9 (purple) in Fig 6 show returns in → grade → restock/scrap; the grey dashed line shows cross-dock for the 855 SKUs shipped but never stocked.</w:t>
+        <w:t xml:space="preserve"> steps 7–9 (purple) in Fig 7 show returns in → grade → restock/scrap; the grey dashed line shows cross-dock for the 855 SKUs shipped but never stocked.</w:t>
       </w:r>
     </w:p>
     <w:p>
@@ -901,7 +955,7 @@
         <w:drawing>
           <wp:inline xmlns:a="http://schemas.openxmlformats.org/drawingml/2006/main" xmlns:pic="http://schemas.openxmlformats.org/drawingml/2006/picture">
             <wp:extent cx="4320000" cy="4750279"/>
-            <wp:docPr id="5" name="Picture 5"/>
+            <wp:docPr id="6" name="Picture 6"/>
             <wp:cNvGraphicFramePr>
               <a:graphicFrameLocks noChangeAspect="1"/>
             </wp:cNvGraphicFramePr>
@@ -913,7 +967,7 @@
                     <pic:cNvPicPr/>
                   </pic:nvPicPr>
                   <pic:blipFill>
-                    <a:blip r:embed="rId13"/>
+                    <a:blip r:embed="rId14"/>
                     <a:stretch>
                       <a:fillRect/>
                     </a:stretch>
@@ -944,7 +998,7 @@
           <w:color w:val="666666"/>
           <w:sz w:val="17"/>
         </w:rPr>
-        <w:t>Fig 5. Returns / reverse-logistics flow.</w:t>
+        <w:t>Fig 6. Returns / reverse-logistics flow.</w:t>
       </w:r>
     </w:p>
     <w:p>
@@ -2178,7 +2232,7 @@
         <w:drawing>
           <wp:inline xmlns:a="http://schemas.openxmlformats.org/drawingml/2006/main" xmlns:pic="http://schemas.openxmlformats.org/drawingml/2006/picture">
             <wp:extent cx="5760000" cy="5432575"/>
-            <wp:docPr id="6" name="Picture 6"/>
+            <wp:docPr id="7" name="Picture 7"/>
             <wp:cNvGraphicFramePr>
               <a:graphicFrameLocks noChangeAspect="1"/>
             </wp:cNvGraphicFramePr>
@@ -2190,7 +2244,7 @@
                     <pic:cNvPicPr/>
                   </pic:nvPicPr>
                   <pic:blipFill>
-                    <a:blip r:embed="rId14"/>
+                    <a:blip r:embed="rId15"/>
                     <a:stretch>
                       <a:fillRect/>
                     </a:stretch>
@@ -2221,7 +2275,7 @@
           <w:color w:val="666666"/>
           <w:sz w:val="17"/>
         </w:rPr>
-        <w:t>Fig 6. Layout, zoning &amp; full order flow — forward (1–6), returns (7–9), cross-dock.</w:t>
+        <w:t>Fig 7. Layout, zoning &amp; full order flow — forward (1–6), returns (7–9), cross-dock.</w:t>
       </w:r>
     </w:p>
     <w:p>
@@ -2232,7 +2286,7 @@
         <w:drawing>
           <wp:inline xmlns:a="http://schemas.openxmlformats.org/drawingml/2006/main" xmlns:pic="http://schemas.openxmlformats.org/drawingml/2006/picture">
             <wp:extent cx="5040000" cy="4462758"/>
-            <wp:docPr id="7" name="Picture 7"/>
+            <wp:docPr id="8" name="Picture 8"/>
             <wp:cNvGraphicFramePr>
               <a:graphicFrameLocks noChangeAspect="1"/>
             </wp:cNvGraphicFramePr>
@@ -2244,7 +2298,7 @@
                     <pic:cNvPicPr/>
                   </pic:nvPicPr>
                   <pic:blipFill>
-                    <a:blip r:embed="rId15"/>
+                    <a:blip r:embed="rId16"/>
                     <a:stretch>
                       <a:fillRect/>
                     </a:stretch>
@@ -2275,7 +2329,7 @@
           <w:color w:val="666666"/>
           <w:sz w:val="17"/>
         </w:rPr>
-        <w:t>Fig 7. Option B 3D massing (isometric) — reserve racking ≈ 11.5 m within the 12.2 m limit.</w:t>
+        <w:t>Fig 8. Option B 3D massing (isometric) — reserve racking ≈ 11.5 m within the 12.2 m limit.</w:t>
       </w:r>
     </w:p>
     <w:p>
@@ -2286,7 +2340,7 @@
         <w:drawing>
           <wp:inline xmlns:a="http://schemas.openxmlformats.org/drawingml/2006/main" xmlns:pic="http://schemas.openxmlformats.org/drawingml/2006/picture">
             <wp:extent cx="5760000" cy="5439651"/>
-            <wp:docPr id="8" name="Picture 8"/>
+            <wp:docPr id="9" name="Picture 9"/>
             <wp:cNvGraphicFramePr>
               <a:graphicFrameLocks noChangeAspect="1"/>
             </wp:cNvGraphicFramePr>
@@ -2298,7 +2352,7 @@
                     <pic:cNvPicPr/>
                   </pic:nvPicPr>
                   <pic:blipFill>
-                    <a:blip r:embed="rId16"/>
+                    <a:blip r:embed="rId17"/>
                     <a:stretch>
                       <a:fillRect/>
                     </a:stretch>
@@ -2329,7 +2383,7 @@
           <w:color w:val="666666"/>
           <w:sz w:val="17"/>
         </w:rPr>
-        <w:t>Fig 8. Worker movement — zone picking keeps picker paths short and separated.</w:t>
+        <w:t>Fig 9. Worker movement — zone picking keeps picker paths short and separated.</w:t>
       </w:r>
     </w:p>
     <w:p>
@@ -2993,7 +3047,7 @@
         <w:drawing>
           <wp:inline xmlns:a="http://schemas.openxmlformats.org/drawingml/2006/main" xmlns:pic="http://schemas.openxmlformats.org/drawingml/2006/picture">
             <wp:extent cx="5040000" cy="2479726"/>
-            <wp:docPr id="9" name="Picture 9"/>
+            <wp:docPr id="10" name="Picture 10"/>
             <wp:cNvGraphicFramePr>
               <a:graphicFrameLocks noChangeAspect="1"/>
             </wp:cNvGraphicFramePr>
@@ -3005,7 +3059,7 @@
                     <pic:cNvPicPr/>
                   </pic:nvPicPr>
                   <pic:blipFill>
-                    <a:blip r:embed="rId17"/>
+                    <a:blip r:embed="rId18"/>
                     <a:stretch>
                       <a:fillRect/>
                     </a:stretch>
@@ -3036,7 +3090,7 @@
           <w:color w:val="666666"/>
           <w:sz w:val="17"/>
         </w:rPr>
-        <w:t>Fig 9. Labour requirement by process (average vs peak).</w:t>
+        <w:t>Fig 10. Labour requirement by process (average vs peak).</w:t>
       </w:r>
     </w:p>
     <w:p>
@@ -3887,7 +3941,7 @@
       </w:pPr>
     </w:p>
     <w:sectPr>
-      <w:footerReference w:type="default" r:id="rId18"/>
+      <w:footerReference w:type="default" r:id="rId19"/>
       <w:pgSz w:w="12240" w:h="15840"/>
       <w:pgMar w:top="1440" w:right="1800" w:bottom="1440" w:left="1800" w:header="720" w:footer="720" w:gutter="0"/>
       <w:cols w:space="720"/>

</xml_diff>

<commit_message>
Add CAD-style rack-level warehouse floor plan (professional layout drawing)
- analysis/warehouse_floorplan.py: to-scale plan with double-deep rack rows+bays, aisles A1-A11, cross-aisle, forward-pick module, numbered docks, dimension lines, title block, scale bar, north arrow
- build_report_d2: floor plan as Fig 7 (primary layout); renumber figs to 11

Co-Authored-By: Claude Opus 4.8 <noreply@anthropic.com>
</commit_message>
<xml_diff>
--- a/deliverables/Deliverable_2_Future_State.docx
+++ b/deliverables/Deliverable_2_Future_State.docx
@@ -944,7 +944,7 @@
           <w:b w:val="0"/>
           <w:sz w:val="21"/>
         </w:rPr>
-        <w:t xml:space="preserve"> steps 7–9 (purple) in Fig 7 show returns in → grade → restock/scrap; the grey dashed line shows cross-dock for the 855 SKUs shipped but never stocked.</w:t>
+        <w:t xml:space="preserve"> steps 7–9 (purple) in Fig 8 show returns in → grade → restock/scrap; the grey dashed line shows cross-dock for the 855 SKUs shipped but never stocked.</w:t>
       </w:r>
     </w:p>
     <w:p>
@@ -2231,8 +2231,62 @@
       <w:r>
         <w:drawing>
           <wp:inline xmlns:a="http://schemas.openxmlformats.org/drawingml/2006/main" xmlns:pic="http://schemas.openxmlformats.org/drawingml/2006/picture">
+            <wp:extent cx="6120000" cy="5258667"/>
+            <wp:docPr id="7" name="Picture 7"/>
+            <wp:cNvGraphicFramePr>
+              <a:graphicFrameLocks noChangeAspect="1"/>
+            </wp:cNvGraphicFramePr>
+            <a:graphic>
+              <a:graphicData uri="http://schemas.openxmlformats.org/drawingml/2006/picture">
+                <pic:pic>
+                  <pic:nvPicPr>
+                    <pic:cNvPr id="0" name="layout_floorplan.png"/>
+                    <pic:cNvPicPr/>
+                  </pic:nvPicPr>
+                  <pic:blipFill>
+                    <a:blip r:embed="rId15"/>
+                    <a:stretch>
+                      <a:fillRect/>
+                    </a:stretch>
+                  </pic:blipFill>
+                  <pic:spPr>
+                    <a:xfrm>
+                      <a:off x="0" y="0"/>
+                      <a:ext cx="6120000" cy="5258667"/>
+                    </a:xfrm>
+                    <a:prstGeom prst="rect"/>
+                  </pic:spPr>
+                </pic:pic>
+              </a:graphicData>
+            </a:graphic>
+          </wp:inline>
+        </w:drawing>
+      </w:r>
+    </w:p>
+    <w:p>
+      <w:pPr>
+        <w:spacing w:after="200"/>
+        <w:jc w:val="center"/>
+      </w:pPr>
+      <w:r>
+        <w:rPr>
+          <w:b w:val="0"/>
+          <w:i/>
+          <w:color w:val="666666"/>
+          <w:sz w:val="17"/>
+        </w:rPr>
+        <w:t>Fig 7. Detailed warehouse floor plan (rack-level, to scale) — racks, aisles, docks, dimensions.</w:t>
+      </w:r>
+    </w:p>
+    <w:p>
+      <w:pPr>
+        <w:jc w:val="center"/>
+      </w:pPr>
+      <w:r>
+        <w:drawing>
+          <wp:inline xmlns:a="http://schemas.openxmlformats.org/drawingml/2006/main" xmlns:pic="http://schemas.openxmlformats.org/drawingml/2006/picture">
             <wp:extent cx="5760000" cy="5432575"/>
-            <wp:docPr id="7" name="Picture 7"/>
+            <wp:docPr id="8" name="Picture 8"/>
             <wp:cNvGraphicFramePr>
               <a:graphicFrameLocks noChangeAspect="1"/>
             </wp:cNvGraphicFramePr>
@@ -2244,7 +2298,7 @@
                     <pic:cNvPicPr/>
                   </pic:nvPicPr>
                   <pic:blipFill>
-                    <a:blip r:embed="rId15"/>
+                    <a:blip r:embed="rId16"/>
                     <a:stretch>
                       <a:fillRect/>
                     </a:stretch>
@@ -2275,7 +2329,7 @@
           <w:color w:val="666666"/>
           <w:sz w:val="17"/>
         </w:rPr>
-        <w:t>Fig 7. Layout, zoning &amp; full order flow — forward (1–6), returns (7–9), cross-dock.</w:t>
+        <w:t>Fig 8. Layout, zoning &amp; full order flow — forward (1–6), returns (7–9), cross-dock.</w:t>
       </w:r>
     </w:p>
     <w:p>
@@ -2286,7 +2340,7 @@
         <w:drawing>
           <wp:inline xmlns:a="http://schemas.openxmlformats.org/drawingml/2006/main" xmlns:pic="http://schemas.openxmlformats.org/drawingml/2006/picture">
             <wp:extent cx="5040000" cy="4462758"/>
-            <wp:docPr id="8" name="Picture 8"/>
+            <wp:docPr id="9" name="Picture 9"/>
             <wp:cNvGraphicFramePr>
               <a:graphicFrameLocks noChangeAspect="1"/>
             </wp:cNvGraphicFramePr>
@@ -2298,7 +2352,7 @@
                     <pic:cNvPicPr/>
                   </pic:nvPicPr>
                   <pic:blipFill>
-                    <a:blip r:embed="rId16"/>
+                    <a:blip r:embed="rId17"/>
                     <a:stretch>
                       <a:fillRect/>
                     </a:stretch>
@@ -2329,7 +2383,7 @@
           <w:color w:val="666666"/>
           <w:sz w:val="17"/>
         </w:rPr>
-        <w:t>Fig 8. Option B 3D massing (isometric) — reserve racking ≈ 11.5 m within the 12.2 m limit.</w:t>
+        <w:t>Fig 9. Option B 3D massing (isometric) — reserve racking ≈ 11.5 m within the 12.2 m limit.</w:t>
       </w:r>
     </w:p>
     <w:p>
@@ -2340,7 +2394,7 @@
         <w:drawing>
           <wp:inline xmlns:a="http://schemas.openxmlformats.org/drawingml/2006/main" xmlns:pic="http://schemas.openxmlformats.org/drawingml/2006/picture">
             <wp:extent cx="5760000" cy="5439651"/>
-            <wp:docPr id="9" name="Picture 9"/>
+            <wp:docPr id="10" name="Picture 10"/>
             <wp:cNvGraphicFramePr>
               <a:graphicFrameLocks noChangeAspect="1"/>
             </wp:cNvGraphicFramePr>
@@ -2352,7 +2406,7 @@
                     <pic:cNvPicPr/>
                   </pic:nvPicPr>
                   <pic:blipFill>
-                    <a:blip r:embed="rId17"/>
+                    <a:blip r:embed="rId18"/>
                     <a:stretch>
                       <a:fillRect/>
                     </a:stretch>
@@ -2383,7 +2437,7 @@
           <w:color w:val="666666"/>
           <w:sz w:val="17"/>
         </w:rPr>
-        <w:t>Fig 9. Worker movement — zone picking keeps picker paths short and separated.</w:t>
+        <w:t>Fig 10. Worker movement — zone picking keeps picker paths short and separated.</w:t>
       </w:r>
     </w:p>
     <w:p>
@@ -3047,7 +3101,7 @@
         <w:drawing>
           <wp:inline xmlns:a="http://schemas.openxmlformats.org/drawingml/2006/main" xmlns:pic="http://schemas.openxmlformats.org/drawingml/2006/picture">
             <wp:extent cx="5040000" cy="2479726"/>
-            <wp:docPr id="10" name="Picture 10"/>
+            <wp:docPr id="11" name="Picture 11"/>
             <wp:cNvGraphicFramePr>
               <a:graphicFrameLocks noChangeAspect="1"/>
             </wp:cNvGraphicFramePr>
@@ -3059,7 +3113,7 @@
                     <pic:cNvPicPr/>
                   </pic:nvPicPr>
                   <pic:blipFill>
-                    <a:blip r:embed="rId18"/>
+                    <a:blip r:embed="rId19"/>
                     <a:stretch>
                       <a:fillRect/>
                     </a:stretch>
@@ -3090,7 +3144,7 @@
           <w:color w:val="666666"/>
           <w:sz w:val="17"/>
         </w:rPr>
-        <w:t>Fig 10. Labour requirement by process (average vs peak).</w:t>
+        <w:t>Fig 11. Labour requirement by process (average vs peak).</w:t>
       </w:r>
     </w:p>
     <w:p>
@@ -3941,7 +3995,7 @@
       </w:pPr>
     </w:p>
     <w:sectPr>
-      <w:footerReference w:type="default" r:id="rId19"/>
+      <w:footerReference w:type="default" r:id="rId20"/>
       <w:pgSz w:w="12240" w:h="15840"/>
       <w:pgMar w:top="1440" w:right="1800" w:bottom="1440" w:left="1800" w:header="720" w:footer="720" w:gutter="0"/>
       <w:cols w:space="720"/>

</xml_diff>

<commit_message>
3D massing: render actual rack rows (double-deep + selective/cantilever) with beam levels & aisles
Co-Authored-By: Claude Opus 4.8 <noreply@anthropic.com>
</commit_message>
<xml_diff>
--- a/deliverables/Deliverable_2_Future_State.docx
+++ b/deliverables/Deliverable_2_Future_State.docx
@@ -2339,7 +2339,7 @@
       <w:r>
         <w:drawing>
           <wp:inline xmlns:a="http://schemas.openxmlformats.org/drawingml/2006/main" xmlns:pic="http://schemas.openxmlformats.org/drawingml/2006/picture">
-            <wp:extent cx="5040000" cy="4462758"/>
+            <wp:extent cx="5040000" cy="4329462"/>
             <wp:docPr id="9" name="Picture 9"/>
             <wp:cNvGraphicFramePr>
               <a:graphicFrameLocks noChangeAspect="1"/>
@@ -2360,7 +2360,7 @@
                   <pic:spPr>
                     <a:xfrm>
                       <a:off x="0" y="0"/>
-                      <a:ext cx="5040000" cy="4462758"/>
+                      <a:ext cx="5040000" cy="4329462"/>
                     </a:xfrm>
                     <a:prstGeom prst="rect"/>
                   </pic:spPr>

</xml_diff>

<commit_message>
3D: cabinet-oblique projection (depth=y, up-left recede) - fixes reserve/offices & outbound/selective overlaps
- proper single-axis depth ordering; all zones visible, no false overlaps; rack rows with beam levels retained

Co-Authored-By: Claude Opus 4.8 <noreply@anthropic.com>
</commit_message>
<xml_diff>
--- a/deliverables/Deliverable_2_Future_State.docx
+++ b/deliverables/Deliverable_2_Future_State.docx
@@ -2339,7 +2339,7 @@
       <w:r>
         <w:drawing>
           <wp:inline xmlns:a="http://schemas.openxmlformats.org/drawingml/2006/main" xmlns:pic="http://schemas.openxmlformats.org/drawingml/2006/picture">
-            <wp:extent cx="5040000" cy="4329462"/>
+            <wp:extent cx="5040000" cy="2095377"/>
             <wp:docPr id="9" name="Picture 9"/>
             <wp:cNvGraphicFramePr>
               <a:graphicFrameLocks noChangeAspect="1"/>
@@ -2360,7 +2360,7 @@
                   <pic:spPr>
                     <a:xfrm>
                       <a:off x="0" y="0"/>
-                      <a:ext cx="5040000" cy="4329462"/>
+                      <a:ext cx="5040000" cy="2095377"/>
                     </a:xfrm>
                     <a:prstGeom prst="rect"/>
                   </pic:spPr>

</xml_diff>

<commit_message>
Add Blender warehouse model + photoreal 3D render (replaces flat matplotlib massing)
- warehouse_model/main.py: parametric Blender build (floor, zones, double-deep rack rows w/ shelf levels, forward-pick, offices, dock doors, pallets, lighting, ortho camera) rendered headless
- warehouse_model/annotate_render.py: title + zone legend
- Deliverable 2 Fig 9 now uses the Blender render (fulfils brief's Blender-model requirement)

Co-Authored-By: Claude Opus 4.8 <noreply@anthropic.com>
</commit_message>
<xml_diff>
--- a/deliverables/Deliverable_2_Future_State.docx
+++ b/deliverables/Deliverable_2_Future_State.docx
@@ -2339,7 +2339,7 @@
       <w:r>
         <w:drawing>
           <wp:inline xmlns:a="http://schemas.openxmlformats.org/drawingml/2006/main" xmlns:pic="http://schemas.openxmlformats.org/drawingml/2006/picture">
-            <wp:extent cx="5040000" cy="2095377"/>
+            <wp:extent cx="5760000" cy="4047265"/>
             <wp:docPr id="9" name="Picture 9"/>
             <wp:cNvGraphicFramePr>
               <a:graphicFrameLocks noChangeAspect="1"/>
@@ -2348,7 +2348,7 @@
               <a:graphicData uri="http://schemas.openxmlformats.org/drawingml/2006/picture">
                 <pic:pic>
                   <pic:nvPicPr>
-                    <pic:cNvPr id="0" name="layout_3d.png"/>
+                    <pic:cNvPr id="0" name="layout_3d_render.png"/>
                     <pic:cNvPicPr/>
                   </pic:nvPicPr>
                   <pic:blipFill>
@@ -2360,7 +2360,7 @@
                   <pic:spPr>
                     <a:xfrm>
                       <a:off x="0" y="0"/>
-                      <a:ext cx="5040000" cy="2095377"/>
+                      <a:ext cx="5760000" cy="4047265"/>
                     </a:xfrm>
                     <a:prstGeom prst="rect"/>
                   </pic:spPr>
@@ -2383,7 +2383,7 @@
           <w:color w:val="666666"/>
           <w:sz w:val="17"/>
         </w:rPr>
-        <w:t>Fig 9. Option B 3D massing (isometric) — reserve racking ≈ 11.5 m within the 12.2 m limit.</w:t>
+        <w:t>Fig 9. Option B — warehouse 3D (Blender render): rack rows, forward-pick, zones, docks.</w:t>
       </w:r>
     </w:p>
     <w:p>

</xml_diff>

<commit_message>
Add Blender worker-movement render (ghosted racks + glowing routes); Deliverable 2 Fig 10
- warehouse_model/workers.py: same warehouse with semi-transparent racks + emissive floor routes per role
- annotate_render.py: title + route-role legend -> layout_worker_render.png

Co-Authored-By: Claude Opus 4.8 <noreply@anthropic.com>
</commit_message>
<xml_diff>
--- a/deliverables/Deliverable_2_Future_State.docx
+++ b/deliverables/Deliverable_2_Future_State.docx
@@ -2393,7 +2393,7 @@
       <w:r>
         <w:drawing>
           <wp:inline xmlns:a="http://schemas.openxmlformats.org/drawingml/2006/main" xmlns:pic="http://schemas.openxmlformats.org/drawingml/2006/picture">
-            <wp:extent cx="5760000" cy="5439651"/>
+            <wp:extent cx="5760000" cy="4225986"/>
             <wp:docPr id="10" name="Picture 10"/>
             <wp:cNvGraphicFramePr>
               <a:graphicFrameLocks noChangeAspect="1"/>
@@ -2402,7 +2402,7 @@
               <a:graphicData uri="http://schemas.openxmlformats.org/drawingml/2006/picture">
                 <pic:pic>
                   <pic:nvPicPr>
-                    <pic:cNvPr id="0" name="layout_worker_flow.png"/>
+                    <pic:cNvPr id="0" name="layout_worker_render.png"/>
                     <pic:cNvPicPr/>
                   </pic:nvPicPr>
                   <pic:blipFill>
@@ -2414,7 +2414,7 @@
                   <pic:spPr>
                     <a:xfrm>
                       <a:off x="0" y="0"/>
-                      <a:ext cx="5760000" cy="5439651"/>
+                      <a:ext cx="5760000" cy="4225986"/>
                     </a:xfrm>
                     <a:prstGeom prst="rect"/>
                   </pic:spPr>
@@ -2437,7 +2437,7 @@
           <w:color w:val="666666"/>
           <w:sz w:val="17"/>
         </w:rPr>
-        <w:t>Fig 10. Worker movement — zone picking keeps picker paths short and separated.</w:t>
+        <w:t>Fig 10. Worker movement (Blender): zone-picking routes through ghosted racks.</w:t>
       </w:r>
     </w:p>
     <w:p>

</xml_diff>

<commit_message>
Best-version worker 3D: solid racks, down-aisle camera, bold floor-lane routes + worker figures
Co-Authored-By: Claude Opus 4.8 <noreply@anthropic.com>
</commit_message>
<xml_diff>
--- a/deliverables/Deliverable_2_Future_State.docx
+++ b/deliverables/Deliverable_2_Future_State.docx
@@ -2393,7 +2393,7 @@
       <w:r>
         <w:drawing>
           <wp:inline xmlns:a="http://schemas.openxmlformats.org/drawingml/2006/main" xmlns:pic="http://schemas.openxmlformats.org/drawingml/2006/picture">
-            <wp:extent cx="5760000" cy="4225986"/>
+            <wp:extent cx="5760000" cy="4408429"/>
             <wp:docPr id="10" name="Picture 10"/>
             <wp:cNvGraphicFramePr>
               <a:graphicFrameLocks noChangeAspect="1"/>
@@ -2414,7 +2414,7 @@
                   <pic:spPr>
                     <a:xfrm>
                       <a:off x="0" y="0"/>
-                      <a:ext cx="5760000" cy="4225986"/>
+                      <a:ext cx="5760000" cy="4408429"/>
                     </a:xfrm>
                     <a:prstGeom prst="rect"/>
                   </pic:spPr>

</xml_diff>

<commit_message>
Fig 8: redraw order-flow map in CAD floor-plan style (matches Fig 7)
Co-Authored-By: Claude Opus 4.8 <noreply@anthropic.com>
</commit_message>
<xml_diff>
--- a/deliverables/Deliverable_2_Future_State.docx
+++ b/deliverables/Deliverable_2_Future_State.docx
@@ -2305,7 +2305,7 @@
       <w:r>
         <w:drawing>
           <wp:inline xmlns:a="http://schemas.openxmlformats.org/drawingml/2006/main" xmlns:pic="http://schemas.openxmlformats.org/drawingml/2006/picture">
-            <wp:extent cx="5760000" cy="5432575"/>
+            <wp:extent cx="5760000" cy="4302439"/>
             <wp:docPr id="8" name="Picture 8"/>
             <wp:cNvGraphicFramePr>
               <a:graphicFrameLocks noChangeAspect="1"/>
@@ -2314,7 +2314,7 @@
               <a:graphicData uri="http://schemas.openxmlformats.org/drawingml/2006/picture">
                 <pic:pic>
                   <pic:nvPicPr>
-                    <pic:cNvPr id="0" name="layout_plan.png"/>
+                    <pic:cNvPr id="0" name="layout_orderflow.png"/>
                     <pic:cNvPicPr/>
                   </pic:nvPicPr>
                   <pic:blipFill>
@@ -2326,7 +2326,7 @@
                   <pic:spPr>
                     <a:xfrm>
                       <a:off x="0" y="0"/>
-                      <a:ext cx="5760000" cy="5432575"/>
+                      <a:ext cx="5760000" cy="4302439"/>
                     </a:xfrm>
                     <a:prstGeom prst="rect"/>
                   </pic:spPr>

</xml_diff>

<commit_message>
Explain the put-to-light wall: layout, slots, storage and worker steps
- New putwall_design.py: plan of the packing area with the 8 worker steps
  and a front view of the wall (24 x 5 = 120 tote slots, 10.8 m).
- Wall sized on totes per small order (78% one tote, 13% two, 9% 3-4):
  peak wave 73 orders x 1.35 totes x 1.2 -> 120 slots (was 90).
- D3 3.1: what the wall is, where items are stored before it, roles and
  how people move; D2 2.4 gets the figure and a short description.
- Packing-area check and CAPEX updated for the larger wall.

Co-Authored-By: Claude Opus 5.5 <noreply@anthropic.com>
Claude-Session: https://claude.ai/code/session_019BDu8Mejto8wmgVTUqspvV
</commit_message>
<xml_diff>
--- a/deliverables/Deliverable_2_Future_State.docx
+++ b/deliverables/Deliverable_2_Future_State.docx
@@ -2123,7 +2123,32 @@
           <w:b w:val="0"/>
           <w:sz w:val="21"/>
         </w:rPr>
-        <w:t xml:space="preserve"> picked roll cages → put-to-light sort by order → pack, print-and-apply → parcel cartons onto roll cages by carrier / pallets wrapped → stage by carrier → live-load at the booked time → dispatch.</w:t>
+        <w:t xml:space="preserve"> full trolleys of batch-picked totes → put-to-light wall sorts the items into orders → pack, print-and-apply → parcel cartons onto roll cages by carrier / large-order pallets wrapped → stage by carrier → live-load at the booked time → dispatch.</w:t>
+      </w:r>
+    </w:p>
+    <w:p>
+      <w:pPr>
+        <w:pStyle w:val="ListBullet"/>
+      </w:pPr>
+      <w:r>
+        <w:rPr>
+          <w:b w:val="0"/>
+          <w:sz w:val="21"/>
+        </w:rPr>
+      </w:r>
+      <w:r>
+        <w:rPr>
+          <w:b/>
+          <w:sz w:val="21"/>
+        </w:rPr>
+        <w:t>The put-to-light wall (Fig 5b):</w:t>
+      </w:r>
+      <w:r>
+        <w:rPr>
+          <w:b w:val="0"/>
+          <w:sz w:val="21"/>
+        </w:rPr>
+        <w:t xml:space="preserve"> 24 × 5 = 120 slots, 10.8 m long, open on both sides; each slot holds one order tote. The putter scans an item, the slot of its order lights up with the quantity, the item goes in and the light is pressed. When an order is complete the light on the pack side goes on and the packer takes the tote out. Small slow parts are picked from the bin shelving directly behind the wall (Deliverable 3, §3.1).</w:t>
       </w:r>
     </w:p>
     <w:p>
@@ -2232,6 +2257,60 @@
     </w:p>
     <w:p>
       <w:pPr>
+        <w:jc w:val="center"/>
+      </w:pPr>
+      <w:r>
+        <w:drawing>
+          <wp:inline xmlns:a="http://schemas.openxmlformats.org/drawingml/2006/main" xmlns:pic="http://schemas.openxmlformats.org/drawingml/2006/picture">
+            <wp:extent cx="6120000" cy="3405088"/>
+            <wp:docPr id="6" name="Picture 6"/>
+            <wp:cNvGraphicFramePr>
+              <a:graphicFrameLocks noChangeAspect="1"/>
+            </wp:cNvGraphicFramePr>
+            <a:graphic>
+              <a:graphicData uri="http://schemas.openxmlformats.org/drawingml/2006/picture">
+                <pic:pic>
+                  <pic:nvPicPr>
+                    <pic:cNvPr id="0" name="putwall_layout.png"/>
+                    <pic:cNvPicPr/>
+                  </pic:nvPicPr>
+                  <pic:blipFill>
+                    <a:blip r:embed="rId14"/>
+                    <a:stretch>
+                      <a:fillRect/>
+                    </a:stretch>
+                  </pic:blipFill>
+                  <pic:spPr>
+                    <a:xfrm>
+                      <a:off x="0" y="0"/>
+                      <a:ext cx="6120000" cy="3405088"/>
+                    </a:xfrm>
+                    <a:prstGeom prst="rect"/>
+                  </pic:spPr>
+                </pic:pic>
+              </a:graphicData>
+            </a:graphic>
+          </wp:inline>
+        </w:drawing>
+      </w:r>
+    </w:p>
+    <w:p>
+      <w:pPr>
+        <w:spacing w:after="200"/>
+        <w:jc w:val="center"/>
+      </w:pPr>
+      <w:r>
+        <w:rPr>
+          <w:b w:val="0"/>
+          <w:i/>
+          <w:color w:val="666666"/>
+          <w:sz w:val="17"/>
+        </w:rPr>
+        <w:t>Fig 5b. Put-to-light wall: the packing area from above with the worker steps, and the front of the wall.</w:t>
+      </w:r>
+    </w:p>
+    <w:p>
+      <w:pPr>
         <w:pStyle w:val="Heading2"/>
       </w:pPr>
       <w:r>
@@ -2296,7 +2375,7 @@
         <w:drawing>
           <wp:inline xmlns:a="http://schemas.openxmlformats.org/drawingml/2006/main" xmlns:pic="http://schemas.openxmlformats.org/drawingml/2006/picture">
             <wp:extent cx="4320000" cy="4750279"/>
-            <wp:docPr id="6" name="Picture 6"/>
+            <wp:docPr id="7" name="Picture 7"/>
             <wp:cNvGraphicFramePr>
               <a:graphicFrameLocks noChangeAspect="1"/>
             </wp:cNvGraphicFramePr>
@@ -2308,7 +2387,7 @@
                     <pic:cNvPicPr/>
                   </pic:nvPicPr>
                   <pic:blipFill>
-                    <a:blip r:embed="rId14"/>
+                    <a:blip r:embed="rId15"/>
                     <a:stretch>
                       <a:fillRect/>
                     </a:stretch>
@@ -4277,7 +4356,7 @@
         <w:drawing>
           <wp:inline xmlns:a="http://schemas.openxmlformats.org/drawingml/2006/main" xmlns:pic="http://schemas.openxmlformats.org/drawingml/2006/picture">
             <wp:extent cx="5580000" cy="2262622"/>
-            <wp:docPr id="7" name="Picture 7"/>
+            <wp:docPr id="8" name="Picture 8"/>
             <wp:cNvGraphicFramePr>
               <a:graphicFrameLocks noChangeAspect="1"/>
             </wp:cNvGraphicFramePr>
@@ -4289,7 +4368,7 @@
                     <pic:cNvPicPr/>
                   </pic:nvPicPr>
                   <pic:blipFill>
-                    <a:blip r:embed="rId15"/>
+                    <a:blip r:embed="rId16"/>
                     <a:stretch>
                       <a:fillRect/>
                     </a:stretch>
@@ -4958,7 +5037,7 @@
         <w:drawing>
           <wp:inline xmlns:a="http://schemas.openxmlformats.org/drawingml/2006/main" xmlns:pic="http://schemas.openxmlformats.org/drawingml/2006/picture">
             <wp:extent cx="5040000" cy="2622335"/>
-            <wp:docPr id="8" name="Picture 8"/>
+            <wp:docPr id="9" name="Picture 9"/>
             <wp:cNvGraphicFramePr>
               <a:graphicFrameLocks noChangeAspect="1"/>
             </wp:cNvGraphicFramePr>
@@ -4970,7 +5049,7 @@
                     <pic:cNvPicPr/>
                   </pic:nvPicPr>
                   <pic:blipFill>
-                    <a:blip r:embed="rId16"/>
+                    <a:blip r:embed="rId17"/>
                     <a:stretch>
                       <a:fillRect/>
                     </a:stretch>
@@ -5435,7 +5514,7 @@
         <w:drawing>
           <wp:inline xmlns:a="http://schemas.openxmlformats.org/drawingml/2006/main" xmlns:pic="http://schemas.openxmlformats.org/drawingml/2006/picture">
             <wp:extent cx="6120000" cy="2376863"/>
-            <wp:docPr id="9" name="Picture 9"/>
+            <wp:docPr id="10" name="Picture 10"/>
             <wp:cNvGraphicFramePr>
               <a:graphicFrameLocks noChangeAspect="1"/>
             </wp:cNvGraphicFramePr>
@@ -5447,7 +5526,7 @@
                     <pic:cNvPicPr/>
                   </pic:nvPicPr>
                   <pic:blipFill>
-                    <a:blip r:embed="rId17"/>
+                    <a:blip r:embed="rId18"/>
                     <a:stretch>
                       <a:fillRect/>
                     </a:stretch>
@@ -8196,7 +8275,7 @@
         <w:drawing>
           <wp:inline xmlns:a="http://schemas.openxmlformats.org/drawingml/2006/main" xmlns:pic="http://schemas.openxmlformats.org/drawingml/2006/picture">
             <wp:extent cx="6120000" cy="5135046"/>
-            <wp:docPr id="10" name="Picture 10"/>
+            <wp:docPr id="11" name="Picture 11"/>
             <wp:cNvGraphicFramePr>
               <a:graphicFrameLocks noChangeAspect="1"/>
             </wp:cNvGraphicFramePr>
@@ -8208,7 +8287,7 @@
                     <pic:cNvPicPr/>
                   </pic:nvPicPr>
                   <pic:blipFill>
-                    <a:blip r:embed="rId18"/>
+                    <a:blip r:embed="rId19"/>
                     <a:stretch>
                       <a:fillRect/>
                     </a:stretch>
@@ -8250,7 +8329,7 @@
         <w:drawing>
           <wp:inline xmlns:a="http://schemas.openxmlformats.org/drawingml/2006/main" xmlns:pic="http://schemas.openxmlformats.org/drawingml/2006/picture">
             <wp:extent cx="5760000" cy="3850288"/>
-            <wp:docPr id="11" name="Picture 11"/>
+            <wp:docPr id="12" name="Picture 12"/>
             <wp:cNvGraphicFramePr>
               <a:graphicFrameLocks noChangeAspect="1"/>
             </wp:cNvGraphicFramePr>
@@ -8262,7 +8341,7 @@
                     <pic:cNvPicPr/>
                   </pic:nvPicPr>
                   <pic:blipFill>
-                    <a:blip r:embed="rId19"/>
+                    <a:blip r:embed="rId20"/>
                     <a:stretch>
                       <a:fillRect/>
                     </a:stretch>
@@ -8304,7 +8383,7 @@
         <w:drawing>
           <wp:inline xmlns:a="http://schemas.openxmlformats.org/drawingml/2006/main" xmlns:pic="http://schemas.openxmlformats.org/drawingml/2006/picture">
             <wp:extent cx="5760000" cy="4050989"/>
-            <wp:docPr id="12" name="Picture 12"/>
+            <wp:docPr id="13" name="Picture 13"/>
             <wp:cNvGraphicFramePr>
               <a:graphicFrameLocks noChangeAspect="1"/>
             </wp:cNvGraphicFramePr>
@@ -8316,7 +8395,7 @@
                     <pic:cNvPicPr/>
                   </pic:nvPicPr>
                   <pic:blipFill>
-                    <a:blip r:embed="rId20"/>
+                    <a:blip r:embed="rId21"/>
                     <a:stretch>
                       <a:fillRect/>
                     </a:stretch>
@@ -8358,7 +8437,7 @@
         <w:drawing>
           <wp:inline xmlns:a="http://schemas.openxmlformats.org/drawingml/2006/main" xmlns:pic="http://schemas.openxmlformats.org/drawingml/2006/picture">
             <wp:extent cx="5760000" cy="3722620"/>
-            <wp:docPr id="13" name="Picture 13"/>
+            <wp:docPr id="14" name="Picture 14"/>
             <wp:cNvGraphicFramePr>
               <a:graphicFrameLocks noChangeAspect="1"/>
             </wp:cNvGraphicFramePr>
@@ -8370,7 +8449,7 @@
                     <pic:cNvPicPr/>
                   </pic:nvPicPr>
                   <pic:blipFill>
-                    <a:blip r:embed="rId21"/>
+                    <a:blip r:embed="rId22"/>
                     <a:stretch>
                       <a:fillRect/>
                     </a:stretch>
@@ -11187,7 +11266,7 @@
               <w:rPr>
                 <w:sz w:val="19"/>
               </w:rPr>
-              <w:t>Put-to-light wall (90 slots, both sides)</w:t>
+              <w:t>Put-to-light wall (120 tote slots, 10.8 m, work strip both sides)</w:t>
             </w:r>
           </w:p>
         </w:tc>
@@ -11205,7 +11284,7 @@
               <w:rPr>
                 <w:sz w:val="19"/>
               </w:rPr>
-              <w:t>22</w:t>
+              <w:t>39</w:t>
             </w:r>
           </w:p>
         </w:tc>
@@ -11445,7 +11524,7 @@
               <w:rPr>
                 <w:sz w:val="19"/>
               </w:rPr>
-              <w:t>401</w:t>
+              <w:t>423</w:t>
             </w:r>
           </w:p>
         </w:tc>
@@ -12602,7 +12681,7 @@
         <w:drawing>
           <wp:inline xmlns:a="http://schemas.openxmlformats.org/drawingml/2006/main" xmlns:pic="http://schemas.openxmlformats.org/drawingml/2006/picture">
             <wp:extent cx="5040000" cy="2208272"/>
-            <wp:docPr id="14" name="Picture 14"/>
+            <wp:docPr id="15" name="Picture 15"/>
             <wp:cNvGraphicFramePr>
               <a:graphicFrameLocks noChangeAspect="1"/>
             </wp:cNvGraphicFramePr>
@@ -12614,7 +12693,7 @@
                     <pic:cNvPicPr/>
                   </pic:nvPicPr>
                   <pic:blipFill>
-                    <a:blip r:embed="rId22"/>
+                    <a:blip r:embed="rId23"/>
                     <a:stretch>
                       <a:fillRect/>
                     </a:stretch>
@@ -12678,7 +12757,7 @@
         <w:drawing>
           <wp:inline xmlns:a="http://schemas.openxmlformats.org/drawingml/2006/main" xmlns:pic="http://schemas.openxmlformats.org/drawingml/2006/picture">
             <wp:extent cx="5040000" cy="2437689"/>
-            <wp:docPr id="15" name="Picture 15"/>
+            <wp:docPr id="16" name="Picture 16"/>
             <wp:cNvGraphicFramePr>
               <a:graphicFrameLocks noChangeAspect="1"/>
             </wp:cNvGraphicFramePr>
@@ -12690,7 +12769,7 @@
                     <pic:cNvPicPr/>
                   </pic:nvPicPr>
                   <pic:blipFill>
-                    <a:blip r:embed="rId23"/>
+                    <a:blip r:embed="rId24"/>
                     <a:stretch>
                       <a:fillRect/>
                     </a:stretch>
@@ -14681,7 +14760,7 @@
               <w:rPr>
                 <w:sz w:val="19"/>
               </w:rPr>
-              <w:t>sorts batch-picked small orders (84% of orders) into orders at packing</w:t>
+              <w:t>sorts batch-picked small orders (84% of orders) into orders at packing; 120 tote slots</w:t>
             </w:r>
           </w:p>
         </w:tc>
@@ -19630,7 +19709,7 @@
       </w:r>
     </w:p>
     <w:sectPr>
-      <w:footerReference w:type="default" r:id="rId24"/>
+      <w:footerReference w:type="default" r:id="rId25"/>
       <w:pgSz w:w="12240" w:h="15840"/>
       <w:pgMar w:top="1440" w:right="1800" w:bottom="1440" w:left="1800" w:header="720" w:footer="720" w:gutter="0"/>
       <w:cols w:space="720"/>

</xml_diff>

<commit_message>
Show the put-to-light wall on the layout; replace the messy wall figure
- Floor plan: packing area now shows the put-to-light wall, pack stations,
  roll cages and small-parts shelving (legend added); the pick flow ends at
  the wall's pick side, the pack flow leaves from the roll cages.
- Packing-area positions defined once in geometry.py.
- New putwall_where.png: whole warehouse (north up) with the spot marked,
  enlarged view with lettered places A-H and a key.
- New putwall_how.png: side view (pick side, wall, pack side) in 4 steps.
- Old putwall_layout.png removed; D2 and D3 text and captions updated.

Co-Authored-By: Claude Opus 5.5 <noreply@anthropic.com>
Claude-Session: https://claude.ai/code/session_019BDu8Mejto8wmgVTUqspvV
</commit_message>
<xml_diff>
--- a/deliverables/Deliverable_2_Future_State.docx
+++ b/deliverables/Deliverable_2_Future_State.docx
@@ -2141,14 +2141,39 @@
           <w:b/>
           <w:sz w:val="21"/>
         </w:rPr>
-        <w:t>The put-to-light wall (Fig 5b):</w:t>
+        <w:t>Where:</w:t>
       </w:r>
       <w:r>
         <w:rPr>
           <w:b w:val="0"/>
           <w:sz w:val="21"/>
         </w:rPr>
-        <w:t xml:space="preserve"> 24 × 5 = 120 slots, 10.8 m long, open on both sides; each slot holds one order tote. The putter scans an item, the slot of its order lights up with the quantity, the item goes in and the light is pressed. When an order is complete the light on the pack side goes on and the packer takes the tote out. Small slow parts are picked from the bin shelving directly behind the wall (Deliverable 3, §3.1).</w:t>
+        <w:t xml:space="preserve"> the put-to-light wall stands at the south end of the packing area (east side), with its pick side on the right perimeter aisle where the pickers arrive and the pack stations behind it (Fig 5b).</w:t>
+      </w:r>
+    </w:p>
+    <w:p>
+      <w:pPr>
+        <w:pStyle w:val="ListBullet"/>
+      </w:pPr>
+      <w:r>
+        <w:rPr>
+          <w:b w:val="0"/>
+          <w:sz w:val="21"/>
+        </w:rPr>
+      </w:r>
+      <w:r>
+        <w:rPr>
+          <w:b/>
+          <w:sz w:val="21"/>
+        </w:rPr>
+        <w:t>The put-to-light wall (Fig 5c):</w:t>
+      </w:r>
+      <w:r>
+        <w:rPr>
+          <w:b w:val="0"/>
+          <w:sz w:val="21"/>
+        </w:rPr>
+        <w:t xml:space="preserve"> 24 × 5 = 120 slots, 10.8 m long, open on both sides; each slot holds one order tote. The putter scans an item, the slot of its order lights up with the quantity, the item goes in and the light is pressed. When an order is complete the light on the pack side goes on and the packer takes the tote out. Small slow parts are picked from the bin shelving directly behind the wall (Deliverable 3, §3.1–3.2).</w:t>
       </w:r>
     </w:p>
     <w:p>
@@ -2262,7 +2287,7 @@
       <w:r>
         <w:drawing>
           <wp:inline xmlns:a="http://schemas.openxmlformats.org/drawingml/2006/main" xmlns:pic="http://schemas.openxmlformats.org/drawingml/2006/picture">
-            <wp:extent cx="6120000" cy="3405088"/>
+            <wp:extent cx="6120000" cy="8272210"/>
             <wp:docPr id="6" name="Picture 6"/>
             <wp:cNvGraphicFramePr>
               <a:graphicFrameLocks noChangeAspect="1"/>
@@ -2271,7 +2296,7 @@
               <a:graphicData uri="http://schemas.openxmlformats.org/drawingml/2006/picture">
                 <pic:pic>
                   <pic:nvPicPr>
-                    <pic:cNvPr id="0" name="putwall_layout.png"/>
+                    <pic:cNvPr id="0" name="putwall_where.png"/>
                     <pic:cNvPicPr/>
                   </pic:nvPicPr>
                   <pic:blipFill>
@@ -2283,7 +2308,7 @@
                   <pic:spPr>
                     <a:xfrm>
                       <a:off x="0" y="0"/>
-                      <a:ext cx="6120000" cy="3405088"/>
+                      <a:ext cx="6120000" cy="8272210"/>
                     </a:xfrm>
                     <a:prstGeom prst="rect"/>
                   </pic:spPr>
@@ -2306,7 +2331,61 @@
           <w:color w:val="666666"/>
           <w:sz w:val="17"/>
         </w:rPr>
-        <w:t>Fig 5b. Put-to-light wall: the packing area from above with the worker steps, and the front of the wall.</w:t>
+        <w:t>Fig 5b. Where the put-to-light wall is: the whole warehouse and the packing area enlarged.</w:t>
+      </w:r>
+    </w:p>
+    <w:p>
+      <w:pPr>
+        <w:jc w:val="center"/>
+      </w:pPr>
+      <w:r>
+        <w:drawing>
+          <wp:inline xmlns:a="http://schemas.openxmlformats.org/drawingml/2006/main" xmlns:pic="http://schemas.openxmlformats.org/drawingml/2006/picture">
+            <wp:extent cx="5760000" cy="3206893"/>
+            <wp:docPr id="7" name="Picture 7"/>
+            <wp:cNvGraphicFramePr>
+              <a:graphicFrameLocks noChangeAspect="1"/>
+            </wp:cNvGraphicFramePr>
+            <a:graphic>
+              <a:graphicData uri="http://schemas.openxmlformats.org/drawingml/2006/picture">
+                <pic:pic>
+                  <pic:nvPicPr>
+                    <pic:cNvPr id="0" name="putwall_how.png"/>
+                    <pic:cNvPicPr/>
+                  </pic:nvPicPr>
+                  <pic:blipFill>
+                    <a:blip r:embed="rId15"/>
+                    <a:stretch>
+                      <a:fillRect/>
+                    </a:stretch>
+                  </pic:blipFill>
+                  <pic:spPr>
+                    <a:xfrm>
+                      <a:off x="0" y="0"/>
+                      <a:ext cx="5760000" cy="3206893"/>
+                    </a:xfrm>
+                    <a:prstGeom prst="rect"/>
+                  </pic:spPr>
+                </pic:pic>
+              </a:graphicData>
+            </a:graphic>
+          </wp:inline>
+        </w:drawing>
+      </w:r>
+    </w:p>
+    <w:p>
+      <w:pPr>
+        <w:spacing w:after="200"/>
+        <w:jc w:val="center"/>
+      </w:pPr>
+      <w:r>
+        <w:rPr>
+          <w:b w:val="0"/>
+          <w:i/>
+          <w:color w:val="666666"/>
+          <w:sz w:val="17"/>
+        </w:rPr>
+        <w:t>Fig 5c. How the put-to-light wall works, seen from the side.</w:t>
       </w:r>
     </w:p>
     <w:p>
@@ -2375,7 +2454,7 @@
         <w:drawing>
           <wp:inline xmlns:a="http://schemas.openxmlformats.org/drawingml/2006/main" xmlns:pic="http://schemas.openxmlformats.org/drawingml/2006/picture">
             <wp:extent cx="4320000" cy="4750279"/>
-            <wp:docPr id="7" name="Picture 7"/>
+            <wp:docPr id="8" name="Picture 8"/>
             <wp:cNvGraphicFramePr>
               <a:graphicFrameLocks noChangeAspect="1"/>
             </wp:cNvGraphicFramePr>
@@ -2387,7 +2466,7 @@
                     <pic:cNvPicPr/>
                   </pic:nvPicPr>
                   <pic:blipFill>
-                    <a:blip r:embed="rId15"/>
+                    <a:blip r:embed="rId16"/>
                     <a:stretch>
                       <a:fillRect/>
                     </a:stretch>
@@ -4356,7 +4435,7 @@
         <w:drawing>
           <wp:inline xmlns:a="http://schemas.openxmlformats.org/drawingml/2006/main" xmlns:pic="http://schemas.openxmlformats.org/drawingml/2006/picture">
             <wp:extent cx="5580000" cy="2262622"/>
-            <wp:docPr id="8" name="Picture 8"/>
+            <wp:docPr id="9" name="Picture 9"/>
             <wp:cNvGraphicFramePr>
               <a:graphicFrameLocks noChangeAspect="1"/>
             </wp:cNvGraphicFramePr>
@@ -4368,7 +4447,7 @@
                     <pic:cNvPicPr/>
                   </pic:nvPicPr>
                   <pic:blipFill>
-                    <a:blip r:embed="rId16"/>
+                    <a:blip r:embed="rId17"/>
                     <a:stretch>
                       <a:fillRect/>
                     </a:stretch>
@@ -5037,7 +5116,7 @@
         <w:drawing>
           <wp:inline xmlns:a="http://schemas.openxmlformats.org/drawingml/2006/main" xmlns:pic="http://schemas.openxmlformats.org/drawingml/2006/picture">
             <wp:extent cx="5040000" cy="2622335"/>
-            <wp:docPr id="9" name="Picture 9"/>
+            <wp:docPr id="10" name="Picture 10"/>
             <wp:cNvGraphicFramePr>
               <a:graphicFrameLocks noChangeAspect="1"/>
             </wp:cNvGraphicFramePr>
@@ -5049,7 +5128,7 @@
                     <pic:cNvPicPr/>
                   </pic:nvPicPr>
                   <pic:blipFill>
-                    <a:blip r:embed="rId17"/>
+                    <a:blip r:embed="rId18"/>
                     <a:stretch>
                       <a:fillRect/>
                     </a:stretch>
@@ -5514,7 +5593,7 @@
         <w:drawing>
           <wp:inline xmlns:a="http://schemas.openxmlformats.org/drawingml/2006/main" xmlns:pic="http://schemas.openxmlformats.org/drawingml/2006/picture">
             <wp:extent cx="6120000" cy="2376863"/>
-            <wp:docPr id="10" name="Picture 10"/>
+            <wp:docPr id="11" name="Picture 11"/>
             <wp:cNvGraphicFramePr>
               <a:graphicFrameLocks noChangeAspect="1"/>
             </wp:cNvGraphicFramePr>
@@ -5526,7 +5605,7 @@
                     <pic:cNvPicPr/>
                   </pic:nvPicPr>
                   <pic:blipFill>
-                    <a:blip r:embed="rId18"/>
+                    <a:blip r:embed="rId19"/>
                     <a:stretch>
                       <a:fillRect/>
                     </a:stretch>
@@ -8275,7 +8354,7 @@
         <w:drawing>
           <wp:inline xmlns:a="http://schemas.openxmlformats.org/drawingml/2006/main" xmlns:pic="http://schemas.openxmlformats.org/drawingml/2006/picture">
             <wp:extent cx="6120000" cy="5135046"/>
-            <wp:docPr id="11" name="Picture 11"/>
+            <wp:docPr id="12" name="Picture 12"/>
             <wp:cNvGraphicFramePr>
               <a:graphicFrameLocks noChangeAspect="1"/>
             </wp:cNvGraphicFramePr>
@@ -8287,7 +8366,7 @@
                     <pic:cNvPicPr/>
                   </pic:nvPicPr>
                   <pic:blipFill>
-                    <a:blip r:embed="rId19"/>
+                    <a:blip r:embed="rId20"/>
                     <a:stretch>
                       <a:fillRect/>
                     </a:stretch>
@@ -8318,7 +8397,7 @@
           <w:color w:val="666666"/>
           <w:sz w:val="17"/>
         </w:rPr>
-        <w:t>Fig 10. Detailed warehouse floor plan (rack-level, to scale) — racks, aisles, docks, dimensions.</w:t>
+        <w:t>Fig 10. Detailed warehouse floor plan (rack-level, to scale) — racks, aisles, docks, dimensions; inside the packing area: put-to-light wall, pack stations, roll cages and small-parts shelving.</w:t>
       </w:r>
     </w:p>
     <w:p>
@@ -8328,8 +8407,8 @@
       <w:r>
         <w:drawing>
           <wp:inline xmlns:a="http://schemas.openxmlformats.org/drawingml/2006/main" xmlns:pic="http://schemas.openxmlformats.org/drawingml/2006/picture">
-            <wp:extent cx="5760000" cy="3850288"/>
-            <wp:docPr id="12" name="Picture 12"/>
+            <wp:extent cx="5760000" cy="3573850"/>
+            <wp:docPr id="13" name="Picture 13"/>
             <wp:cNvGraphicFramePr>
               <a:graphicFrameLocks noChangeAspect="1"/>
             </wp:cNvGraphicFramePr>
@@ -8341,7 +8420,7 @@
                     <pic:cNvPicPr/>
                   </pic:nvPicPr>
                   <pic:blipFill>
-                    <a:blip r:embed="rId20"/>
+                    <a:blip r:embed="rId21"/>
                     <a:stretch>
                       <a:fillRect/>
                     </a:stretch>
@@ -8349,7 +8428,7 @@
                   <pic:spPr>
                     <a:xfrm>
                       <a:off x="0" y="0"/>
-                      <a:ext cx="5760000" cy="3850288"/>
+                      <a:ext cx="5760000" cy="3573850"/>
                     </a:xfrm>
                     <a:prstGeom prst="rect"/>
                   </pic:spPr>
@@ -8372,7 +8451,7 @@
           <w:color w:val="666666"/>
           <w:sz w:val="17"/>
         </w:rPr>
-        <w:t>Fig 11. Main flow on the floor plan: in (R1) → put away → refill → pick → pack → out (S2). Arrows follow the real truck and picker routes.</w:t>
+        <w:t>Fig 11. Main flow on the floor plan: in (R2) → put away → refill → pick → put-to-light wall and pack → out (S2). Arrows follow the real truck and picker routes; container flow C via R1.</w:t>
       </w:r>
     </w:p>
     <w:p>
@@ -8383,7 +8462,7 @@
         <w:drawing>
           <wp:inline xmlns:a="http://schemas.openxmlformats.org/drawingml/2006/main" xmlns:pic="http://schemas.openxmlformats.org/drawingml/2006/picture">
             <wp:extent cx="5760000" cy="4050989"/>
-            <wp:docPr id="13" name="Picture 13"/>
+            <wp:docPr id="14" name="Picture 14"/>
             <wp:cNvGraphicFramePr>
               <a:graphicFrameLocks noChangeAspect="1"/>
             </wp:cNvGraphicFramePr>
@@ -8395,7 +8474,7 @@
                     <pic:cNvPicPr/>
                   </pic:nvPicPr>
                   <pic:blipFill>
-                    <a:blip r:embed="rId21"/>
+                    <a:blip r:embed="rId22"/>
                     <a:stretch>
                       <a:fillRect/>
                     </a:stretch>
@@ -8437,7 +8516,7 @@
         <w:drawing>
           <wp:inline xmlns:a="http://schemas.openxmlformats.org/drawingml/2006/main" xmlns:pic="http://schemas.openxmlformats.org/drawingml/2006/picture">
             <wp:extent cx="5760000" cy="3722620"/>
-            <wp:docPr id="14" name="Picture 14"/>
+            <wp:docPr id="15" name="Picture 15"/>
             <wp:cNvGraphicFramePr>
               <a:graphicFrameLocks noChangeAspect="1"/>
             </wp:cNvGraphicFramePr>
@@ -8449,7 +8528,7 @@
                     <pic:cNvPicPr/>
                   </pic:nvPicPr>
                   <pic:blipFill>
-                    <a:blip r:embed="rId22"/>
+                    <a:blip r:embed="rId23"/>
                     <a:stretch>
                       <a:fillRect/>
                     </a:stretch>
@@ -12681,7 +12760,7 @@
         <w:drawing>
           <wp:inline xmlns:a="http://schemas.openxmlformats.org/drawingml/2006/main" xmlns:pic="http://schemas.openxmlformats.org/drawingml/2006/picture">
             <wp:extent cx="5040000" cy="2208272"/>
-            <wp:docPr id="15" name="Picture 15"/>
+            <wp:docPr id="16" name="Picture 16"/>
             <wp:cNvGraphicFramePr>
               <a:graphicFrameLocks noChangeAspect="1"/>
             </wp:cNvGraphicFramePr>
@@ -12693,7 +12772,7 @@
                     <pic:cNvPicPr/>
                   </pic:nvPicPr>
                   <pic:blipFill>
-                    <a:blip r:embed="rId23"/>
+                    <a:blip r:embed="rId24"/>
                     <a:stretch>
                       <a:fillRect/>
                     </a:stretch>
@@ -12757,7 +12836,7 @@
         <w:drawing>
           <wp:inline xmlns:a="http://schemas.openxmlformats.org/drawingml/2006/main" xmlns:pic="http://schemas.openxmlformats.org/drawingml/2006/picture">
             <wp:extent cx="5040000" cy="2437689"/>
-            <wp:docPr id="16" name="Picture 16"/>
+            <wp:docPr id="17" name="Picture 17"/>
             <wp:cNvGraphicFramePr>
               <a:graphicFrameLocks noChangeAspect="1"/>
             </wp:cNvGraphicFramePr>
@@ -12769,7 +12848,7 @@
                     <pic:cNvPicPr/>
                   </pic:nvPicPr>
                   <pic:blipFill>
-                    <a:blip r:embed="rId24"/>
+                    <a:blip r:embed="rId25"/>
                     <a:stretch>
                       <a:fillRect/>
                     </a:stretch>
@@ -19709,7 +19788,7 @@
       </w:r>
     </w:p>
     <w:sectPr>
-      <w:footerReference w:type="default" r:id="rId25"/>
+      <w:footerReference w:type="default" r:id="rId26"/>
       <w:pgSz w:w="12240" w:h="15840"/>
       <w:pgMar w:top="1440" w:right="1800" w:bottom="1440" w:left="1800" w:header="720" w:footer="720" w:gutter="0"/>
       <w:cols w:space="720"/>

</xml_diff>